<commit_message>
Minor edit to 7, Update of Errata list for 5, addition of piece 1 materials
</commit_message>
<xml_diff>
--- a/Working Folder/5 Lee Ji Heng 李智恒 - Dark Light 黑光/5 Lee Ji Heng 李智恒 - Dark Light 黑光 - Errata_v1.docx
+++ b/Working Folder/5 Lee Ji Heng 李智恒 - Dark Light 黑光/5 Lee Ji Heng 李智恒 - Dark Light 黑光 - Errata_v1.docx
@@ -754,6 +754,13 @@
                 <w:color w:val="FF0000"/>
               </w:rPr>
             </w:pPr>
+            <w:r>
+              <w:rPr>
+                <w:rFonts w:ascii="Times" w:eastAsia="Times" w:hAnsi="Times" w:cs="Times"/>
+                <w:color w:val="FF0000"/>
+              </w:rPr>
+              <w:t>Yes</w:t>
+            </w:r>
           </w:p>
         </w:tc>
       </w:tr>
@@ -896,6 +903,13 @@
                 <w:color w:val="FF0000"/>
               </w:rPr>
             </w:pPr>
+            <w:r>
+              <w:rPr>
+                <w:rFonts w:ascii="Times" w:eastAsia="Times" w:hAnsi="Times" w:cs="Times"/>
+                <w:color w:val="FF0000"/>
+              </w:rPr>
+              <w:t>Yes</w:t>
+            </w:r>
           </w:p>
         </w:tc>
       </w:tr>
@@ -979,6 +993,29 @@
                 <w:color w:val="FF0000"/>
               </w:rPr>
             </w:pPr>
+            <w:r>
+              <w:rPr>
+                <w:rFonts w:ascii="Times" w:eastAsia="Times" w:hAnsi="Times" w:cs="Times"/>
+                <w:color w:val="FF0000"/>
+              </w:rPr>
+              <w:t xml:space="preserve">Apologies for this. Perhaps F# C# (‘D major’) could work. The harmony in the strings largely follows a pitch set [G C </w:t>
+            </w:r>
+            <w:proofErr w:type="spellStart"/>
+            <w:r>
+              <w:rPr>
+                <w:rFonts w:ascii="Times" w:eastAsia="Times" w:hAnsi="Times" w:cs="Times"/>
+                <w:color w:val="FF0000"/>
+              </w:rPr>
+              <w:t>C</w:t>
+            </w:r>
+            <w:proofErr w:type="spellEnd"/>
+            <w:r>
+              <w:rPr>
+                <w:rFonts w:ascii="Times" w:eastAsia="Times" w:hAnsi="Times" w:cs="Times"/>
+                <w:color w:val="FF0000"/>
+              </w:rPr>
+              <w:t># D F#]</w:t>
+            </w:r>
           </w:p>
         </w:tc>
       </w:tr>
@@ -1085,6 +1122,13 @@
                 <w:color w:val="FF0000"/>
               </w:rPr>
             </w:pPr>
+            <w:r>
+              <w:rPr>
+                <w:rFonts w:ascii="Times" w:eastAsia="Times" w:hAnsi="Times" w:cs="Times"/>
+                <w:color w:val="FF0000"/>
+              </w:rPr>
+              <w:t>It might have been a typo, apologies.</w:t>
+            </w:r>
           </w:p>
         </w:tc>
       </w:tr>
@@ -1233,6 +1277,38 @@
                 <w:color w:val="FF0000"/>
               </w:rPr>
             </w:pPr>
+            <w:r>
+              <w:rPr>
+                <w:rFonts w:ascii="Times New Roman" w:hAnsi="Times New Roman" w:cs="Times New Roman"/>
+                <w:color w:val="FF0000"/>
+              </w:rPr>
+              <w:t>Here I was referring to the ‘Lower Set’ (using the description from SCO’s Instrument Chart)</w:t>
+            </w:r>
+          </w:p>
+          <w:p>
+            <w:pPr>
+              <w:jc w:val="center"/>
+              <w:rPr>
+                <w:rFonts w:ascii="Times New Roman" w:hAnsi="Times New Roman" w:cs="Times New Roman"/>
+                <w:color w:val="FF0000"/>
+              </w:rPr>
+            </w:pPr>
+          </w:p>
+          <w:p>
+            <w:pPr>
+              <w:jc w:val="center"/>
+              <w:rPr>
+                <w:rFonts w:ascii="Times New Roman" w:hAnsi="Times New Roman" w:cs="Times New Roman"/>
+                <w:color w:val="FF0000"/>
+              </w:rPr>
+            </w:pPr>
+            <w:r>
+              <w:rPr>
+                <w:rFonts w:ascii="Times New Roman" w:hAnsi="Times New Roman" w:cs="Times New Roman"/>
+                <w:color w:val="FF0000"/>
+              </w:rPr>
+              <w:t>I am referring to the same gong.</w:t>
+            </w:r>
           </w:p>
         </w:tc>
       </w:tr>
@@ -1339,6 +1415,13 @@
                 <w:color w:val="FF0000"/>
               </w:rPr>
             </w:pPr>
+            <w:r>
+              <w:rPr>
+                <w:rFonts w:ascii="Times New Roman" w:hAnsi="Times New Roman" w:cs="Times New Roman"/>
+                <w:color w:val="FF0000"/>
+              </w:rPr>
+              <w:t xml:space="preserve">Sorry I’m not exactly sure which diminuendo you’re referring to; have you already marked them in for me? To clarify, the dynamic markings function independently from the repeats. </w:t>
+            </w:r>
           </w:p>
         </w:tc>
       </w:tr>
@@ -1450,6 +1533,13 @@
                 <w:color w:val="FF0000"/>
               </w:rPr>
             </w:pPr>
+            <w:r>
+              <w:rPr>
+                <w:rFonts w:ascii="Times New Roman" w:hAnsi="Times New Roman" w:cs="Times New Roman"/>
+                <w:color w:val="FF0000"/>
+              </w:rPr>
+              <w:t>Yup missed that out – thanks!</w:t>
+            </w:r>
           </w:p>
         </w:tc>
       </w:tr>
@@ -1589,6 +1679,95 @@
                 <w:color w:val="FF0000"/>
               </w:rPr>
             </w:pPr>
+            <w:r>
+              <w:rPr>
+                <w:rFonts w:ascii="Times New Roman" w:hAnsi="Times New Roman" w:cs="Times New Roman"/>
+                <w:color w:val="FF0000"/>
+              </w:rPr>
+              <w:t xml:space="preserve">Yes I have intended the double basses to </w:t>
+            </w:r>
+            <w:r>
+              <w:rPr>
+                <w:rFonts w:ascii="Times New Roman" w:hAnsi="Times New Roman" w:cs="Times New Roman"/>
+                <w:color w:val="FF0000"/>
+              </w:rPr>
+              <w:t>‘</w:t>
+            </w:r>
+            <w:r>
+              <w:rPr>
+                <w:rFonts w:ascii="Times New Roman" w:hAnsi="Times New Roman" w:cs="Times New Roman"/>
+                <w:color w:val="FF0000"/>
+              </w:rPr>
+              <w:t>rumble</w:t>
+            </w:r>
+            <w:r>
+              <w:rPr>
+                <w:rFonts w:ascii="Times New Roman" w:hAnsi="Times New Roman" w:cs="Times New Roman"/>
+                <w:color w:val="FF0000"/>
+              </w:rPr>
+              <w:t>’</w:t>
+            </w:r>
+            <w:r>
+              <w:rPr>
+                <w:rFonts w:ascii="Times New Roman" w:hAnsi="Times New Roman" w:cs="Times New Roman"/>
+                <w:color w:val="FF0000"/>
+              </w:rPr>
+              <w:t xml:space="preserve"> relatively louder than the cellos. But </w:t>
+            </w:r>
+            <w:r>
+              <w:rPr>
+                <w:rFonts w:ascii="Times New Roman" w:hAnsi="Times New Roman" w:cs="Times New Roman"/>
+                <w:color w:val="FF0000"/>
+              </w:rPr>
+              <w:t xml:space="preserve">you raised a good point about the effectiveness of the crescendo at m.84. Could you kindly help me mark in a drop </w:t>
+            </w:r>
+            <w:proofErr w:type="spellStart"/>
+            <w:r>
+              <w:rPr>
+                <w:rFonts w:ascii="Times New Roman" w:hAnsi="Times New Roman" w:cs="Times New Roman"/>
+                <w:color w:val="FF0000"/>
+              </w:rPr>
+              <w:t xml:space="preserve">to </w:t>
+            </w:r>
+            <w:r>
+              <w:rPr>
+                <w:rFonts w:ascii="Times New Roman" w:hAnsi="Times New Roman" w:cs="Times New Roman"/>
+                <w:b/>
+                <w:bCs/>
+                <w:i/>
+                <w:iCs/>
+                <w:color w:val="FF0000"/>
+              </w:rPr>
+              <w:t>p</w:t>
+            </w:r>
+            <w:proofErr w:type="spellEnd"/>
+            <w:r>
+              <w:rPr>
+                <w:rFonts w:ascii="Times New Roman" w:hAnsi="Times New Roman" w:cs="Times New Roman"/>
+                <w:color w:val="FF0000"/>
+              </w:rPr>
+              <w:t xml:space="preserve"> for cellos &amp; basses at m.82, such that it allows them to crescendo to </w:t>
+            </w:r>
+            <w:proofErr w:type="spellStart"/>
+            <w:r>
+              <w:rPr>
+                <w:rFonts w:ascii="Times New Roman" w:hAnsi="Times New Roman" w:cs="Times New Roman"/>
+                <w:b/>
+                <w:bCs/>
+                <w:i/>
+                <w:iCs/>
+                <w:color w:val="FF0000"/>
+              </w:rPr>
+              <w:t>fff</w:t>
+            </w:r>
+            <w:proofErr w:type="spellEnd"/>
+            <w:r>
+              <w:rPr>
+                <w:rFonts w:ascii="Times New Roman" w:hAnsi="Times New Roman" w:cs="Times New Roman"/>
+                <w:color w:val="FF0000"/>
+              </w:rPr>
+              <w:t xml:space="preserve"> at m.84?</w:t>
+            </w:r>
           </w:p>
         </w:tc>
       </w:tr>
@@ -1668,7 +1847,14 @@
               <w:rPr>
                 <w:rFonts w:ascii="Times" w:eastAsia="Times" w:hAnsi="Times" w:cs="Times"/>
               </w:rPr>
-              <w:t xml:space="preserve"> [For Sherman – should I keep it as just </w:t>
+              <w:t xml:space="preserve"> [For Sherman – should I </w:t>
+            </w:r>
+            <w:r>
+              <w:rPr>
+                <w:rFonts w:ascii="Times" w:eastAsia="Times" w:hAnsi="Times" w:cs="Times"/>
+              </w:rPr>
+              <w:lastRenderedPageBreak/>
+              <w:t xml:space="preserve">keep it as just </w:t>
             </w:r>
             <w:proofErr w:type="spellStart"/>
             <w:r>
@@ -1699,6 +1885,22 @@
                 <w:color w:val="FF0000"/>
               </w:rPr>
             </w:pPr>
+            <w:r>
+              <w:rPr>
+                <w:rFonts w:ascii="Times New Roman" w:hAnsi="Times New Roman" w:cs="Times New Roman"/>
+                <w:color w:val="FF0000"/>
+              </w:rPr>
+              <w:lastRenderedPageBreak/>
+              <w:t xml:space="preserve">Yes, you can change it to a single line staff. The Instrument Change </w:t>
+            </w:r>
+            <w:r>
+              <w:rPr>
+                <w:rFonts w:ascii="Times New Roman" w:hAnsi="Times New Roman" w:cs="Times New Roman"/>
+                <w:color w:val="FF0000"/>
+              </w:rPr>
+              <w:lastRenderedPageBreak/>
+              <w:t>function must have messed up.</w:t>
+            </w:r>
           </w:p>
         </w:tc>
       </w:tr>
@@ -1817,6 +2019,13 @@
                 <w:color w:val="FF0000"/>
               </w:rPr>
             </w:pPr>
+            <w:r>
+              <w:rPr>
+                <w:rFonts w:ascii="Times New Roman" w:hAnsi="Times New Roman" w:cs="Times New Roman"/>
+                <w:color w:val="FF0000"/>
+              </w:rPr>
+              <w:t>Thanks</w:t>
+            </w:r>
           </w:p>
         </w:tc>
       </w:tr>
@@ -1893,6 +2102,13 @@
                 <w:color w:val="FF0000"/>
               </w:rPr>
             </w:pPr>
+            <w:r>
+              <w:rPr>
+                <w:rFonts w:ascii="Times New Roman" w:hAnsi="Times New Roman" w:cs="Times New Roman"/>
+                <w:color w:val="FF0000"/>
+              </w:rPr>
+              <w:t>Yes, sorry for the confusion. At m.111, I am referring to suspended cymbals. At rehearsal M, I am referring to handheld cymbals.</w:t>
+            </w:r>
           </w:p>
         </w:tc>
       </w:tr>
@@ -1915,7 +2131,6 @@
               <w:rPr>
                 <w:rFonts w:ascii="Times" w:eastAsia="Times" w:hAnsi="Times" w:cs="Times"/>
               </w:rPr>
-              <w:lastRenderedPageBreak/>
               <w:t>143-44</w:t>
             </w:r>
           </w:p>
@@ -1927,33 +2142,33 @@
           <w:p>
             <w:pPr>
               <w:jc w:val="center"/>
-              <w:rPr>
-                <w:rFonts w:ascii="MS Mincho" w:eastAsia="MS Mincho" w:hAnsi="MS Mincho" w:cs="MS Mincho" w:hint="eastAsia"/>
-                <w:lang w:val="en-US"/>
-              </w:rPr>
-            </w:pPr>
-            <w:proofErr w:type="spellStart"/>
-            <w:r>
               <w:rPr>
                 <w:rFonts w:ascii="MS Mincho" w:eastAsia="MS Mincho" w:hAnsi="MS Mincho" w:cs="MS Mincho"/>
                 <w:lang w:val="en-US"/>
               </w:rPr>
-              <w:t>Vc</w:t>
-            </w:r>
-            <w:proofErr w:type="spellEnd"/>
+            </w:pPr>
+            <w:proofErr w:type="spellStart"/>
             <w:r>
               <w:rPr>
                 <w:rFonts w:ascii="MS Mincho" w:eastAsia="MS Mincho" w:hAnsi="MS Mincho" w:cs="MS Mincho"/>
                 <w:lang w:val="en-US"/>
               </w:rPr>
-              <w:t xml:space="preserve">, </w:t>
-            </w:r>
-            <w:proofErr w:type="spellStart"/>
+              <w:t>Vc</w:t>
+            </w:r>
+            <w:proofErr w:type="spellEnd"/>
             <w:r>
               <w:rPr>
                 <w:rFonts w:ascii="MS Mincho" w:eastAsia="MS Mincho" w:hAnsi="MS Mincho" w:cs="MS Mincho"/>
                 <w:lang w:val="en-US"/>
               </w:rPr>
+              <w:t xml:space="preserve">, </w:t>
+            </w:r>
+            <w:proofErr w:type="spellStart"/>
+            <w:r>
+              <w:rPr>
+                <w:rFonts w:ascii="MS Mincho" w:eastAsia="MS Mincho" w:hAnsi="MS Mincho" w:cs="MS Mincho"/>
+                <w:lang w:val="en-US"/>
+              </w:rPr>
               <w:t>Cb</w:t>
             </w:r>
             <w:proofErr w:type="spellEnd"/>
@@ -1990,6 +2205,13 @@
                 <w:color w:val="FF0000"/>
               </w:rPr>
             </w:pPr>
+            <w:r>
+              <w:rPr>
+                <w:rFonts w:ascii="Times New Roman" w:hAnsi="Times New Roman" w:cs="Times New Roman"/>
+                <w:color w:val="FF0000"/>
+              </w:rPr>
+              <w:t>Thanks</w:t>
+            </w:r>
           </w:p>
         </w:tc>
       </w:tr>
@@ -2099,6 +2321,13 @@
                 <w:color w:val="FF0000"/>
               </w:rPr>
             </w:pPr>
+            <w:r>
+              <w:rPr>
+                <w:rFonts w:ascii="Times New Roman" w:hAnsi="Times New Roman" w:cs="Times New Roman"/>
+                <w:color w:val="FF0000"/>
+              </w:rPr>
+              <w:t>Thanks</w:t>
+            </w:r>
           </w:p>
         </w:tc>
       </w:tr>
@@ -2133,7 +2362,7 @@
             <w:pPr>
               <w:jc w:val="center"/>
               <w:rPr>
-                <w:rFonts w:ascii="MS Mincho" w:eastAsia="MS Mincho" w:hAnsi="MS Mincho" w:cs="MS Mincho" w:hint="eastAsia"/>
+                <w:rFonts w:ascii="MS Mincho" w:eastAsia="MS Mincho" w:hAnsi="MS Mincho" w:cs="MS Mincho"/>
                 <w:lang w:val="en-US"/>
               </w:rPr>
             </w:pPr>
@@ -2193,6 +2422,31 @@
                 <w:color w:val="FF0000"/>
               </w:rPr>
             </w:pPr>
+            <w:r>
+              <w:rPr>
+                <w:rFonts w:ascii="Times New Roman" w:hAnsi="Times New Roman" w:cs="Times New Roman"/>
+                <w:color w:val="FF0000"/>
+              </w:rPr>
+              <w:t xml:space="preserve">Apologies, I think it was a misalignment. The </w:t>
+            </w:r>
+            <w:r>
+              <w:rPr>
+                <w:rFonts w:ascii="Times New Roman" w:hAnsi="Times New Roman" w:cs="Times New Roman"/>
+                <w:b/>
+                <w:bCs/>
+                <w:i/>
+                <w:iCs/>
+                <w:color w:val="FF0000"/>
+              </w:rPr>
+              <w:t>ff</w:t>
+            </w:r>
+            <w:r>
+              <w:rPr>
+                <w:rFonts w:ascii="Times New Roman" w:hAnsi="Times New Roman" w:cs="Times New Roman"/>
+                <w:color w:val="FF0000"/>
+              </w:rPr>
+              <w:t xml:space="preserve"> is supposed to fall on the start of m.148.</w:t>
+            </w:r>
           </w:p>
         </w:tc>
       </w:tr>

</xml_diff>